<commit_message>
Fixed tons of formatting issues
</commit_message>
<xml_diff>
--- a/Coding 1 - year/Unit 1 - Intro to Programming/Daily Lesson Plans/Word/Day 1.docx
+++ b/Coding 1 - year/Unit 1 - Intro to Programming/Daily Lesson Plans/Word/Day 1.docx
@@ -50,12 +50,15 @@
               </w:rPr>
               <w:t xml:space="preserve">Coding I — Full Year</w:t>
             </w:r>
-          </w:p>
-          <w:p>
-            <w:pPr>
-              <w:spacing w:before="40"/>
-              <w:jc w:val="center"/>
-            </w:pPr>
+            <w:r>
+              <w:rPr>
+                <w:rFonts w:ascii="Arial" w:cs="Arial" w:eastAsia="Arial" w:hAnsi="Arial"/>
+                <w:sz w:val="16"/>
+                <w:szCs w:val="16"/>
+              </w:rPr>
+              <w:br/>
+              <w:t xml:space="preserve"/>
+            </w:r>
             <w:r>
               <w:rPr>
                 <w:rFonts w:ascii="Arial" w:cs="Arial" w:eastAsia="Arial" w:hAnsi="Arial"/>
@@ -83,7 +86,7 @@
           <w:rFonts w:ascii="Arial" w:cs="Arial" w:eastAsia="Arial" w:hAnsi="Arial"/>
           <w:b/>
           <w:bCs/>
-          <w:color w:val="1F3864"/>
+          <w:color w:val="2B5797"/>
           <w:sz w:val="32"/>
           <w:szCs w:val="32"/>
         </w:rPr>
@@ -261,9 +264,9 @@
               <w:right w:val="single" w:color="CCCCCC" w:sz="1"/>
             </w:tcBorders>
             <w:tcMar>
-              <w:top w:type="dxa" w:w="60"/>
+              <w:top w:type="dxa" w:w="80"/>
               <w:left w:type="dxa" w:w="120"/>
-              <w:bottom w:type="dxa" w:w="60"/>
+              <w:bottom w:type="dxa" w:w="80"/>
               <w:right w:type="dxa" w:w="120"/>
             </w:tcMar>
           </w:tcPr>
@@ -290,20 +293,213 @@
               <w:right w:val="single" w:color="CCCCCC" w:sz="1"/>
             </w:tcBorders>
             <w:tcMar>
-              <w:top w:type="dxa" w:w="60"/>
+              <w:top w:type="dxa" w:w="80"/>
               <w:left w:type="dxa" w:w="120"/>
-              <w:bottom w:type="dxa" w:w="60"/>
+              <w:bottom w:type="dxa" w:w="80"/>
               <w:right w:type="dxa" w:w="120"/>
             </w:tcMar>
           </w:tcPr>
           <w:p>
-            <w:r>
-              <w:rPr>
-                <w:rFonts w:ascii="Arial" w:cs="Arial" w:eastAsia="Arial" w:hAnsi="Arial"/>
-                <w:sz w:val="20"/>
-                <w:szCs w:val="20"/>
+            <w:pPr>
+              <w:spacing w:after="80" w:before="80"/>
+            </w:pPr>
+            <w:r>
+              <w:rPr>
+                <w:rFonts w:ascii="Arial" w:cs="Arial" w:eastAsia="Arial" w:hAnsi="Arial"/>
+                <w:b/>
+                <w:bCs/>
+                <w:i w:val="false"/>
+                <w:iCs w:val="false"/>
+                <w:color w:val="000000"/>
+                <w:sz w:val="22"/>
+                <w:szCs w:val="22"/>
               </w:rPr>
               <w:t xml:space="preserve">Bell Ringer / Review</w:t>
+            </w:r>
+            <w:r>
+              <w:rPr>
+                <w:rFonts w:ascii="Arial" w:cs="Arial" w:eastAsia="Arial" w:hAnsi="Arial"/>
+                <w:sz w:val="20"/>
+                <w:szCs w:val="20"/>
+              </w:rPr>
+              <w:br/>
+              <w:t xml:space="preserve"/>
+            </w:r>
+            <w:r>
+              <w:rPr>
+                <w:rFonts w:ascii="Arial" w:cs="Arial" w:eastAsia="Arial" w:hAnsi="Arial"/>
+                <w:sz w:val="20"/>
+                <w:szCs w:val="20"/>
+              </w:rPr>
+              <w:br/>
+              <w:t xml:space="preserve"/>
+            </w:r>
+            <w:r>
+              <w:rPr>
+                <w:rFonts w:ascii="Arial" w:cs="Arial" w:eastAsia="Arial" w:hAnsi="Arial"/>
+                <w:b/>
+                <w:bCs/>
+                <w:i w:val="false"/>
+                <w:iCs w:val="false"/>
+                <w:color w:val="000000"/>
+                <w:sz w:val="20"/>
+                <w:szCs w:val="20"/>
+              </w:rPr>
+              <w:t xml:space="preserve">Quick Write </w:t>
+            </w:r>
+            <w:r>
+              <w:rPr>
+                <w:rFonts w:ascii="Arial" w:cs="Arial" w:eastAsia="Arial" w:hAnsi="Arial"/>
+                <w:b w:val="false"/>
+                <w:bCs w:val="false"/>
+                <w:i w:val="false"/>
+                <w:iCs w:val="false"/>
+                <w:color w:val="000000"/>
+                <w:sz w:val="20"/>
+                <w:szCs w:val="20"/>
+              </w:rPr>
+              <w:t xml:space="preserve">(3 min — written or verbal):</w:t>
+            </w:r>
+            <w:r>
+              <w:rPr>
+                <w:rFonts w:ascii="Arial" w:cs="Arial" w:eastAsia="Arial" w:hAnsi="Arial"/>
+                <w:sz w:val="20"/>
+                <w:szCs w:val="20"/>
+              </w:rPr>
+              <w:br/>
+              <w:t xml:space="preserve"/>
+            </w:r>
+            <w:r>
+              <w:rPr>
+                <w:rFonts w:ascii="Arial" w:cs="Arial" w:eastAsia="Arial" w:hAnsi="Arial"/>
+                <w:b w:val="false"/>
+                <w:bCs w:val="false"/>
+                <w:i w:val="false"/>
+                <w:iCs w:val="false"/>
+                <w:color w:val="000000"/>
+                <w:sz w:val="20"/>
+                <w:szCs w:val="20"/>
+              </w:rPr>
+              <w:t xml:space="preserve">    How would you define computer science and explain what an algorithm is?</w:t>
+            </w:r>
+            <w:r>
+              <w:rPr>
+                <w:rFonts w:ascii="Arial" w:cs="Arial" w:eastAsia="Arial" w:hAnsi="Arial"/>
+                <w:sz w:val="20"/>
+                <w:szCs w:val="20"/>
+              </w:rPr>
+              <w:br/>
+              <w:t xml:space="preserve"/>
+            </w:r>
+            <w:r>
+              <w:rPr>
+                <w:rFonts w:ascii="Arial" w:cs="Arial" w:eastAsia="Arial" w:hAnsi="Arial"/>
+                <w:sz w:val="20"/>
+                <w:szCs w:val="20"/>
+              </w:rPr>
+              <w:br/>
+              <w:t xml:space="preserve"/>
+            </w:r>
+            <w:r>
+              <w:rPr>
+                <w:rFonts w:ascii="Arial" w:cs="Arial" w:eastAsia="Arial" w:hAnsi="Arial"/>
+                <w:b/>
+                <w:bCs/>
+                <w:i w:val="false"/>
+                <w:iCs w:val="false"/>
+                <w:color w:val="000000"/>
+                <w:sz w:val="20"/>
+                <w:szCs w:val="20"/>
+              </w:rPr>
+              <w:t xml:space="preserve">Vocabulary Preview — </w:t>
+            </w:r>
+            <w:r>
+              <w:rPr>
+                <w:rFonts w:ascii="Arial" w:cs="Arial" w:eastAsia="Arial" w:hAnsi="Arial"/>
+                <w:b w:val="false"/>
+                <w:bCs w:val="false"/>
+                <w:i w:val="false"/>
+                <w:iCs w:val="false"/>
+                <w:color w:val="000000"/>
+                <w:sz w:val="20"/>
+                <w:szCs w:val="20"/>
+              </w:rPr>
+              <w:t xml:space="preserve">terms we'll use today:</w:t>
+            </w:r>
+            <w:r>
+              <w:rPr>
+                <w:rFonts w:ascii="Arial" w:cs="Arial" w:eastAsia="Arial" w:hAnsi="Arial"/>
+                <w:sz w:val="20"/>
+                <w:szCs w:val="20"/>
+              </w:rPr>
+              <w:br/>
+              <w:t xml:space="preserve"/>
+            </w:r>
+            <w:r>
+              <w:rPr>
+                <w:rFonts w:ascii="Arial" w:cs="Arial" w:eastAsia="Arial" w:hAnsi="Arial"/>
+                <w:b w:val="false"/>
+                <w:bCs w:val="false"/>
+                <w:i w:val="false"/>
+                <w:iCs w:val="false"/>
+                <w:color w:val="000000"/>
+                <w:sz w:val="20"/>
+                <w:szCs w:val="20"/>
+              </w:rPr>
+              <w:t xml:space="preserve">    • algorithms   •   Precise   •   Unambiguous   •   Finite   •   Effective   •   Programs</w:t>
+            </w:r>
+            <w:r>
+              <w:rPr>
+                <w:rFonts w:ascii="Arial" w:cs="Arial" w:eastAsia="Arial" w:hAnsi="Arial"/>
+                <w:sz w:val="20"/>
+                <w:szCs w:val="20"/>
+              </w:rPr>
+              <w:br/>
+              <w:t xml:space="preserve"/>
+            </w:r>
+            <w:r>
+              <w:rPr>
+                <w:rFonts w:ascii="Arial" w:cs="Arial" w:eastAsia="Arial" w:hAnsi="Arial"/>
+                <w:sz w:val="20"/>
+                <w:szCs w:val="20"/>
+              </w:rPr>
+              <w:br/>
+              <w:t xml:space="preserve"/>
+            </w:r>
+            <w:r>
+              <w:rPr>
+                <w:rFonts w:ascii="Arial" w:cs="Arial" w:eastAsia="Arial" w:hAnsi="Arial"/>
+                <w:b w:val="false"/>
+                <w:bCs w:val="false"/>
+                <w:i/>
+                <w:iCs/>
+                <w:color w:val="444444"/>
+                <w:sz w:val="20"/>
+                <w:szCs w:val="20"/>
+              </w:rPr>
+              <w:t xml:space="preserve">Today's Goal: By the end of class you will be able to define computer science and explain what an algorithm is.</w:t>
+            </w:r>
+            <w:r>
+              <w:rPr>
+                <w:rFonts w:ascii="Arial" w:cs="Arial" w:eastAsia="Arial" w:hAnsi="Arial"/>
+                <w:sz w:val="20"/>
+                <w:szCs w:val="20"/>
+              </w:rPr>
+              <w:br/>
+              <w:t xml:space="preserve"/>
+            </w:r>
+            <w:r>
+              <w:rPr>
+                <w:rFonts w:ascii="Arial" w:cs="Arial" w:eastAsia="Arial" w:hAnsi="Arial"/>
+                <w:b w:val="false"/>
+                <w:bCs w:val="false"/>
+                <w:i/>
+                <w:iCs/>
+                <w:color w:val="555555"/>
+                <w:sz w:val="20"/>
+                <w:szCs w:val="20"/>
+              </w:rPr>
+              <w:t xml:space="preserve">→ Pair-share your response, then 2–3 students share with the class.</w:t>
             </w:r>
           </w:p>
         </w:tc>
@@ -319,9 +515,9 @@
               <w:right w:val="single" w:color="CCCCCC" w:sz="1"/>
             </w:tcBorders>
             <w:tcMar>
-              <w:top w:type="dxa" w:w="60"/>
+              <w:top w:type="dxa" w:w="80"/>
               <w:left w:type="dxa" w:w="120"/>
-              <w:bottom w:type="dxa" w:w="60"/>
+              <w:bottom w:type="dxa" w:w="80"/>
               <w:right w:type="dxa" w:w="120"/>
             </w:tcMar>
           </w:tcPr>
@@ -348,20 +544,380 @@
               <w:right w:val="single" w:color="CCCCCC" w:sz="1"/>
             </w:tcBorders>
             <w:tcMar>
-              <w:top w:type="dxa" w:w="60"/>
+              <w:top w:type="dxa" w:w="80"/>
               <w:left w:type="dxa" w:w="120"/>
-              <w:bottom w:type="dxa" w:w="60"/>
+              <w:bottom w:type="dxa" w:w="80"/>
               <w:right w:type="dxa" w:w="120"/>
             </w:tcMar>
           </w:tcPr>
           <w:p>
-            <w:r>
-              <w:rPr>
-                <w:rFonts w:ascii="Arial" w:cs="Arial" w:eastAsia="Arial" w:hAnsi="Arial"/>
-                <w:sz w:val="20"/>
-                <w:szCs w:val="20"/>
-              </w:rPr>
-              <w:t xml:space="preserve">Mini Lesson: What is Computer Science?</w:t>
+            <w:pPr>
+              <w:spacing w:after="80" w:before="80"/>
+            </w:pPr>
+            <w:r>
+              <w:rPr>
+                <w:rFonts w:ascii="Arial" w:cs="Arial" w:eastAsia="Arial" w:hAnsi="Arial"/>
+                <w:b/>
+                <w:bCs/>
+                <w:i w:val="false"/>
+                <w:iCs w:val="false"/>
+                <w:color w:val="000000"/>
+                <w:sz w:val="22"/>
+                <w:szCs w:val="22"/>
+              </w:rPr>
+              <w:t xml:space="preserve">Mini Lesson: </w:t>
+            </w:r>
+            <w:r>
+              <w:rPr>
+                <w:rFonts w:ascii="Arial" w:cs="Arial" w:eastAsia="Arial" w:hAnsi="Arial"/>
+                <w:b w:val="false"/>
+                <w:bCs w:val="false"/>
+                <w:i w:val="false"/>
+                <w:iCs w:val="false"/>
+                <w:color w:val="000000"/>
+                <w:sz w:val="22"/>
+                <w:szCs w:val="22"/>
+              </w:rPr>
+              <w:t xml:space="preserve">What is Computer Science?</w:t>
+            </w:r>
+            <w:r>
+              <w:rPr>
+                <w:rFonts w:ascii="Arial" w:cs="Arial" w:eastAsia="Arial" w:hAnsi="Arial"/>
+                <w:sz w:val="20"/>
+                <w:szCs w:val="20"/>
+              </w:rPr>
+              <w:br/>
+              <w:t xml:space="preserve"/>
+            </w:r>
+            <w:r>
+              <w:rPr>
+                <w:rFonts w:ascii="Arial" w:cs="Arial" w:eastAsia="Arial" w:hAnsi="Arial"/>
+                <w:sz w:val="20"/>
+                <w:szCs w:val="20"/>
+              </w:rPr>
+              <w:br/>
+              <w:t xml:space="preserve"/>
+            </w:r>
+            <w:r>
+              <w:rPr>
+                <w:rFonts w:ascii="Arial" w:cs="Arial" w:eastAsia="Arial" w:hAnsi="Arial"/>
+                <w:b/>
+                <w:bCs/>
+                <w:i/>
+                <w:iCs/>
+                <w:color w:val="000000"/>
+                <w:sz w:val="20"/>
+                <w:szCs w:val="20"/>
+              </w:rPr>
+              <w:t xml:space="preserve">Learning Target: </w:t>
+            </w:r>
+            <w:r>
+              <w:rPr>
+                <w:rFonts w:ascii="Arial" w:cs="Arial" w:eastAsia="Arial" w:hAnsi="Arial"/>
+                <w:b w:val="false"/>
+                <w:bCs w:val="false"/>
+                <w:i/>
+                <w:iCs/>
+                <w:color w:val="333333"/>
+                <w:sz w:val="20"/>
+                <w:szCs w:val="20"/>
+              </w:rPr>
+              <w:t xml:space="preserve">I can define computer science and explain what an algorithm is.</w:t>
+            </w:r>
+            <w:r>
+              <w:rPr>
+                <w:rFonts w:ascii="Arial" w:cs="Arial" w:eastAsia="Arial" w:hAnsi="Arial"/>
+                <w:sz w:val="20"/>
+                <w:szCs w:val="20"/>
+              </w:rPr>
+              <w:br/>
+              <w:t xml:space="preserve"/>
+            </w:r>
+            <w:r>
+              <w:rPr>
+                <w:rFonts w:ascii="Arial" w:cs="Arial" w:eastAsia="Arial" w:hAnsi="Arial"/>
+                <w:sz w:val="20"/>
+                <w:szCs w:val="20"/>
+              </w:rPr>
+              <w:br/>
+              <w:t xml:space="preserve"/>
+            </w:r>
+            <w:r>
+              <w:rPr>
+                <w:rFonts w:ascii="Arial" w:cs="Arial" w:eastAsia="Arial" w:hAnsi="Arial"/>
+                <w:b w:val="false"/>
+                <w:bCs w:val="false"/>
+                <w:i w:val="false"/>
+                <w:iCs w:val="false"/>
+                <w:color w:val="000000"/>
+                <w:sz w:val="20"/>
+                <w:szCs w:val="20"/>
+              </w:rPr>
+              <w:t xml:space="preserve">Computer Science is the study of problem-solving using computers. At its core, it's not really about computers—it's about breaking down complex problems into simple, step-by-step instructions that anyone (or anything) can follow. These step-by-step instruction</w:t>
+            </w:r>
+            <w:r>
+              <w:rPr>
+                <w:rFonts w:ascii="Arial" w:cs="Arial" w:eastAsia="Arial" w:hAnsi="Arial"/>
+                <w:sz w:val="20"/>
+                <w:szCs w:val="20"/>
+              </w:rPr>
+              <w:br/>
+              <w:t xml:space="preserve"/>
+            </w:r>
+            <w:r>
+              <w:rPr>
+                <w:rFonts w:ascii="Arial" w:cs="Arial" w:eastAsia="Arial" w:hAnsi="Arial"/>
+                <w:b w:val="false"/>
+                <w:bCs w:val="false"/>
+                <w:i w:val="false"/>
+                <w:iCs w:val="false"/>
+                <w:color w:val="000000"/>
+                <w:sz w:val="20"/>
+                <w:szCs w:val="20"/>
+              </w:rPr>
+              <w:t xml:space="preserve">An algorithm is an ordered sequence of steps that solves a problem or accomplishes a task. Think of it like a recipe: if you follow the steps in order, you get the desired result. Algorithms must be:</w:t>
+            </w:r>
+            <w:r>
+              <w:rPr>
+                <w:rFonts w:ascii="Arial" w:cs="Arial" w:eastAsia="Arial" w:hAnsi="Arial"/>
+                <w:sz w:val="20"/>
+                <w:szCs w:val="20"/>
+              </w:rPr>
+              <w:br/>
+              <w:t xml:space="preserve"/>
+            </w:r>
+            <w:r>
+              <w:rPr>
+                <w:rFonts w:ascii="Arial" w:cs="Arial" w:eastAsia="Arial" w:hAnsi="Arial"/>
+                <w:sz w:val="20"/>
+                <w:szCs w:val="20"/>
+              </w:rPr>
+              <w:br/>
+              <w:t xml:space="preserve"/>
+            </w:r>
+            <w:r>
+              <w:rPr>
+                <w:rFonts w:ascii="Arial" w:cs="Arial" w:eastAsia="Arial" w:hAnsi="Arial"/>
+                <w:b/>
+                <w:bCs/>
+                <w:i w:val="false"/>
+                <w:iCs w:val="false"/>
+                <w:color w:val="000000"/>
+                <w:sz w:val="20"/>
+                <w:szCs w:val="20"/>
+              </w:rPr>
+              <w:t xml:space="preserve">Key Concepts:</w:t>
+            </w:r>
+            <w:r>
+              <w:rPr>
+                <w:rFonts w:ascii="Arial" w:cs="Arial" w:eastAsia="Arial" w:hAnsi="Arial"/>
+                <w:sz w:val="20"/>
+                <w:szCs w:val="20"/>
+              </w:rPr>
+              <w:br/>
+              <w:t xml:space="preserve"/>
+            </w:r>
+            <w:r>
+              <w:rPr>
+                <w:rFonts w:ascii="Arial" w:cs="Arial" w:eastAsia="Arial" w:hAnsi="Arial"/>
+                <w:b w:val="false"/>
+                <w:bCs w:val="false"/>
+                <w:i w:val="false"/>
+                <w:iCs w:val="false"/>
+                <w:color w:val="000000"/>
+                <w:sz w:val="20"/>
+                <w:szCs w:val="20"/>
+              </w:rPr>
+              <w:t xml:space="preserve">    • Precise: No ambiguity; each step must be clear and exact</w:t>
+            </w:r>
+            <w:r>
+              <w:rPr>
+                <w:rFonts w:ascii="Arial" w:cs="Arial" w:eastAsia="Arial" w:hAnsi="Arial"/>
+                <w:sz w:val="20"/>
+                <w:szCs w:val="20"/>
+              </w:rPr>
+              <w:br/>
+              <w:t xml:space="preserve"/>
+            </w:r>
+            <w:r>
+              <w:rPr>
+                <w:rFonts w:ascii="Arial" w:cs="Arial" w:eastAsia="Arial" w:hAnsi="Arial"/>
+                <w:b w:val="false"/>
+                <w:bCs w:val="false"/>
+                <w:i w:val="false"/>
+                <w:iCs w:val="false"/>
+                <w:color w:val="000000"/>
+                <w:sz w:val="20"/>
+                <w:szCs w:val="20"/>
+              </w:rPr>
+              <w:t xml:space="preserve">    • Unambiguous: Only one way to interpret each instruction</w:t>
+            </w:r>
+            <w:r>
+              <w:rPr>
+                <w:rFonts w:ascii="Arial" w:cs="Arial" w:eastAsia="Arial" w:hAnsi="Arial"/>
+                <w:sz w:val="20"/>
+                <w:szCs w:val="20"/>
+              </w:rPr>
+              <w:br/>
+              <w:t xml:space="preserve"/>
+            </w:r>
+            <w:r>
+              <w:rPr>
+                <w:rFonts w:ascii="Arial" w:cs="Arial" w:eastAsia="Arial" w:hAnsi="Arial"/>
+                <w:b w:val="false"/>
+                <w:bCs w:val="false"/>
+                <w:i w:val="false"/>
+                <w:iCs w:val="false"/>
+                <w:color w:val="000000"/>
+                <w:sz w:val="20"/>
+                <w:szCs w:val="20"/>
+              </w:rPr>
+              <w:t xml:space="preserve">    • Finite: Must eventually end (not an infinite loop)</w:t>
+            </w:r>
+            <w:r>
+              <w:rPr>
+                <w:rFonts w:ascii="Arial" w:cs="Arial" w:eastAsia="Arial" w:hAnsi="Arial"/>
+                <w:sz w:val="20"/>
+                <w:szCs w:val="20"/>
+              </w:rPr>
+              <w:br/>
+              <w:t xml:space="preserve"/>
+            </w:r>
+            <w:r>
+              <w:rPr>
+                <w:rFonts w:ascii="Arial" w:cs="Arial" w:eastAsia="Arial" w:hAnsi="Arial"/>
+                <w:b w:val="false"/>
+                <w:bCs w:val="false"/>
+                <w:i w:val="false"/>
+                <w:iCs w:val="false"/>
+                <w:color w:val="000000"/>
+                <w:sz w:val="20"/>
+                <w:szCs w:val="20"/>
+              </w:rPr>
+              <w:t xml:space="preserve">    • Effective: Actually solves the problem as intended</w:t>
+            </w:r>
+            <w:r>
+              <w:rPr>
+                <w:rFonts w:ascii="Arial" w:cs="Arial" w:eastAsia="Arial" w:hAnsi="Arial"/>
+                <w:sz w:val="20"/>
+                <w:szCs w:val="20"/>
+              </w:rPr>
+              <w:br/>
+              <w:t xml:space="preserve"/>
+            </w:r>
+            <w:r>
+              <w:rPr>
+                <w:rFonts w:ascii="Arial" w:cs="Arial" w:eastAsia="Arial" w:hAnsi="Arial"/>
+                <w:sz w:val="20"/>
+                <w:szCs w:val="20"/>
+              </w:rPr>
+              <w:br/>
+              <w:t xml:space="preserve"/>
+            </w:r>
+            <w:r>
+              <w:rPr>
+                <w:rFonts w:ascii="Arial" w:cs="Arial" w:eastAsia="Arial" w:hAnsi="Arial"/>
+                <w:b/>
+                <w:bCs/>
+                <w:i w:val="false"/>
+                <w:iCs w:val="false"/>
+                <w:color w:val="000000"/>
+                <w:sz w:val="20"/>
+                <w:szCs w:val="20"/>
+              </w:rPr>
+              <w:t xml:space="preserve">Vocabulary: </w:t>
+            </w:r>
+            <w:r>
+              <w:rPr>
+                <w:rFonts w:ascii="Arial" w:cs="Arial" w:eastAsia="Arial" w:hAnsi="Arial"/>
+                <w:b w:val="false"/>
+                <w:bCs w:val="false"/>
+                <w:i w:val="false"/>
+                <w:iCs w:val="false"/>
+                <w:color w:val="000000"/>
+                <w:sz w:val="20"/>
+                <w:szCs w:val="20"/>
+              </w:rPr>
+              <w:t xml:space="preserve">algorithms, Precise, Unambiguous, Finite, Effective, Programs</w:t>
+            </w:r>
+            <w:r>
+              <w:rPr>
+                <w:rFonts w:ascii="Arial" w:cs="Arial" w:eastAsia="Arial" w:hAnsi="Arial"/>
+                <w:sz w:val="20"/>
+                <w:szCs w:val="20"/>
+              </w:rPr>
+              <w:br/>
+              <w:t xml:space="preserve"/>
+            </w:r>
+            <w:r>
+              <w:rPr>
+                <w:rFonts w:ascii="Arial" w:cs="Arial" w:eastAsia="Arial" w:hAnsi="Arial"/>
+                <w:sz w:val="20"/>
+                <w:szCs w:val="20"/>
+              </w:rPr>
+              <w:br/>
+              <w:t xml:space="preserve"/>
+            </w:r>
+            <w:r>
+              <w:rPr>
+                <w:rFonts w:ascii="Arial" w:cs="Arial" w:eastAsia="Arial" w:hAnsi="Arial"/>
+                <w:b/>
+                <w:bCs/>
+                <w:i/>
+                <w:iCs/>
+                <w:color w:val="555555"/>
+                <w:sz w:val="20"/>
+                <w:szCs w:val="20"/>
+              </w:rPr>
+              <w:t xml:space="preserve">→ Live Demo — </w:t>
+            </w:r>
+            <w:r>
+              <w:rPr>
+                <w:rFonts w:ascii="Arial" w:cs="Arial" w:eastAsia="Arial" w:hAnsi="Arial"/>
+                <w:b w:val="false"/>
+                <w:bCs w:val="false"/>
+                <w:i/>
+                <w:iCs/>
+                <w:color w:val="555555"/>
+                <w:sz w:val="20"/>
+                <w:szCs w:val="20"/>
+              </w:rPr>
+              <w:t xml:space="preserve">type examples as students follow along in their own editor.</w:t>
+            </w:r>
+            <w:r>
+              <w:rPr>
+                <w:rFonts w:ascii="Arial" w:cs="Arial" w:eastAsia="Arial" w:hAnsi="Arial"/>
+                <w:sz w:val="20"/>
+                <w:szCs w:val="20"/>
+              </w:rPr>
+              <w:br/>
+              <w:t xml:space="preserve"/>
+            </w:r>
+            <w:r>
+              <w:rPr>
+                <w:rFonts w:ascii="Arial" w:cs="Arial" w:eastAsia="Arial" w:hAnsi="Arial"/>
+                <w:b/>
+                <w:bCs/>
+                <w:i/>
+                <w:iCs/>
+                <w:color w:val="555555"/>
+                <w:sz w:val="20"/>
+                <w:szCs w:val="20"/>
+              </w:rPr>
+              <w:t xml:space="preserve">→ Check for Understanding: </w:t>
+            </w:r>
+            <w:r>
+              <w:rPr>
+                <w:rFonts w:ascii="Arial" w:cs="Arial" w:eastAsia="Arial" w:hAnsi="Arial"/>
+                <w:b w:val="false"/>
+                <w:bCs w:val="false"/>
+                <w:i/>
+                <w:iCs/>
+                <w:color w:val="555555"/>
+                <w:sz w:val="20"/>
+                <w:szCs w:val="20"/>
+              </w:rPr>
+              <w:t xml:space="preserve">pause and cold-call: “Can someone explain what we just did in their own words?”</w:t>
             </w:r>
           </w:p>
         </w:tc>
@@ -377,9 +933,9 @@
               <w:right w:val="single" w:color="CCCCCC" w:sz="1"/>
             </w:tcBorders>
             <w:tcMar>
-              <w:top w:type="dxa" w:w="60"/>
+              <w:top w:type="dxa" w:w="80"/>
               <w:left w:type="dxa" w:w="120"/>
-              <w:bottom w:type="dxa" w:w="60"/>
+              <w:bottom w:type="dxa" w:w="80"/>
               <w:right w:type="dxa" w:w="120"/>
             </w:tcMar>
           </w:tcPr>
@@ -406,20 +962,90 @@
               <w:right w:val="single" w:color="CCCCCC" w:sz="1"/>
             </w:tcBorders>
             <w:tcMar>
-              <w:top w:type="dxa" w:w="60"/>
+              <w:top w:type="dxa" w:w="80"/>
               <w:left w:type="dxa" w:w="120"/>
-              <w:bottom w:type="dxa" w:w="60"/>
+              <w:bottom w:type="dxa" w:w="80"/>
               <w:right w:type="dxa" w:w="120"/>
             </w:tcMar>
           </w:tcPr>
           <w:p>
-            <w:r>
-              <w:rPr>
-                <w:rFonts w:ascii="Arial" w:cs="Arial" w:eastAsia="Arial" w:hAnsi="Arial"/>
-                <w:sz w:val="20"/>
-                <w:szCs w:val="20"/>
+            <w:pPr>
+              <w:spacing w:after="80" w:before="80"/>
+            </w:pPr>
+            <w:r>
+              <w:rPr>
+                <w:rFonts w:ascii="Arial" w:cs="Arial" w:eastAsia="Arial" w:hAnsi="Arial"/>
+                <w:b/>
+                <w:bCs/>
+                <w:i w:val="false"/>
+                <w:iCs w:val="false"/>
+                <w:color w:val="000000"/>
+                <w:sz w:val="22"/>
+                <w:szCs w:val="22"/>
               </w:rPr>
               <w:t xml:space="preserve">Guided Practice</w:t>
+            </w:r>
+            <w:r>
+              <w:rPr>
+                <w:rFonts w:ascii="Arial" w:cs="Arial" w:eastAsia="Arial" w:hAnsi="Arial"/>
+                <w:sz w:val="20"/>
+                <w:szCs w:val="20"/>
+              </w:rPr>
+              <w:br/>
+              <w:t xml:space="preserve"/>
+            </w:r>
+            <w:r>
+              <w:rPr>
+                <w:rFonts w:ascii="Arial" w:cs="Arial" w:eastAsia="Arial" w:hAnsi="Arial"/>
+                <w:sz w:val="20"/>
+                <w:szCs w:val="20"/>
+              </w:rPr>
+              <w:br/>
+              <w:t xml:space="preserve"/>
+            </w:r>
+            <w:r>
+              <w:rPr>
+                <w:rFonts w:ascii="Arial" w:cs="Arial" w:eastAsia="Arial" w:hAnsi="Arial"/>
+                <w:b w:val="false"/>
+                <w:bCs w:val="false"/>
+                <w:i w:val="false"/>
+                <w:iCs w:val="false"/>
+                <w:color w:val="000000"/>
+                <w:sz w:val="20"/>
+                <w:szCs w:val="20"/>
+              </w:rPr>
+              <w:t xml:space="preserve">Write a 3-line Python program that outputs a haiku (5-7-5 syllable structure). Then write an algorithm in plain English for brushing your teeth—make sure each step is precise and unambiguous. Would a robot be able to follow your algorithm without asking questions?</w:t>
+            </w:r>
+            <w:r>
+              <w:rPr>
+                <w:rFonts w:ascii="Arial" w:cs="Arial" w:eastAsia="Arial" w:hAnsi="Arial"/>
+                <w:sz w:val="20"/>
+                <w:szCs w:val="20"/>
+              </w:rPr>
+              <w:br/>
+              <w:t xml:space="preserve"/>
+            </w:r>
+            <w:r>
+              <w:rPr>
+                <w:rFonts w:ascii="Arial" w:cs="Arial" w:eastAsia="Arial" w:hAnsi="Arial"/>
+                <w:sz w:val="20"/>
+                <w:szCs w:val="20"/>
+              </w:rPr>
+              <w:br/>
+              <w:t xml:space="preserve"/>
+            </w:r>
+            <w:r>
+              <w:rPr>
+                <w:rFonts w:ascii="Arial" w:cs="Arial" w:eastAsia="Arial" w:hAnsi="Arial"/>
+                <w:b w:val="false"/>
+                <w:bCs w:val="false"/>
+                <w:i/>
+                <w:iCs/>
+                <w:color w:val="555555"/>
+                <w:sz w:val="20"/>
+                <w:szCs w:val="20"/>
+              </w:rPr>
+              <w:t xml:space="preserve">→ Teacher models — students try alongside, then compare results.</w:t>
             </w:r>
           </w:p>
         </w:tc>
@@ -435,9 +1061,9 @@
               <w:right w:val="single" w:color="CCCCCC" w:sz="1"/>
             </w:tcBorders>
             <w:tcMar>
-              <w:top w:type="dxa" w:w="60"/>
+              <w:top w:type="dxa" w:w="80"/>
               <w:left w:type="dxa" w:w="120"/>
-              <w:bottom w:type="dxa" w:w="60"/>
+              <w:bottom w:type="dxa" w:w="80"/>
               <w:right w:type="dxa" w:w="120"/>
             </w:tcMar>
           </w:tcPr>
@@ -450,7 +1076,7 @@
                 <w:sz w:val="20"/>
                 <w:szCs w:val="20"/>
               </w:rPr>
-              <w:t xml:space="preserve">15-20 min</w:t>
+              <w:t xml:space="preserve">15–20 min</w:t>
             </w:r>
           </w:p>
         </w:tc>
@@ -464,20 +1090,164 @@
               <w:right w:val="single" w:color="CCCCCC" w:sz="1"/>
             </w:tcBorders>
             <w:tcMar>
-              <w:top w:type="dxa" w:w="60"/>
+              <w:top w:type="dxa" w:w="80"/>
               <w:left w:type="dxa" w:w="120"/>
-              <w:bottom w:type="dxa" w:w="60"/>
+              <w:bottom w:type="dxa" w:w="80"/>
               <w:right w:type="dxa" w:w="120"/>
             </w:tcMar>
           </w:tcPr>
           <w:p>
-            <w:r>
-              <w:rPr>
-                <w:rFonts w:ascii="Arial" w:cs="Arial" w:eastAsia="Arial" w:hAnsi="Arial"/>
-                <w:sz w:val="20"/>
-                <w:szCs w:val="20"/>
+            <w:pPr>
+              <w:spacing w:after="80" w:before="80"/>
+            </w:pPr>
+            <w:r>
+              <w:rPr>
+                <w:rFonts w:ascii="Arial" w:cs="Arial" w:eastAsia="Arial" w:hAnsi="Arial"/>
+                <w:b/>
+                <w:bCs/>
+                <w:i w:val="false"/>
+                <w:iCs w:val="false"/>
+                <w:color w:val="000000"/>
+                <w:sz w:val="22"/>
+                <w:szCs w:val="22"/>
               </w:rPr>
               <w:t xml:space="preserve">Independent Practice / Code Along</w:t>
+            </w:r>
+            <w:r>
+              <w:rPr>
+                <w:rFonts w:ascii="Arial" w:cs="Arial" w:eastAsia="Arial" w:hAnsi="Arial"/>
+                <w:sz w:val="20"/>
+                <w:szCs w:val="20"/>
+              </w:rPr>
+              <w:br/>
+              <w:t xml:space="preserve"/>
+            </w:r>
+            <w:r>
+              <w:rPr>
+                <w:rFonts w:ascii="Arial" w:cs="Arial" w:eastAsia="Arial" w:hAnsi="Arial"/>
+                <w:b/>
+                <w:bCs/>
+                <w:i w:val="false"/>
+                <w:iCs w:val="false"/>
+                <w:color w:val="000000"/>
+                <w:sz w:val="20"/>
+                <w:szCs w:val="20"/>
+              </w:rPr>
+              <w:t xml:space="preserve">    Beginner: </w:t>
+            </w:r>
+            <w:r>
+              <w:rPr>
+                <w:rFonts w:ascii="Arial" w:cs="Arial" w:eastAsia="Arial" w:hAnsi="Arial"/>
+                <w:b w:val="false"/>
+                <w:bCs w:val="false"/>
+                <w:i w:val="false"/>
+                <w:iCs w:val="false"/>
+                <w:color w:val="000000"/>
+                <w:sz w:val="20"/>
+                <w:szCs w:val="20"/>
+              </w:rPr>
+              <w:t xml:space="preserve">Write three print() statements that together output your name, your grade level, and your favorite hobby, each on its own line.</w:t>
+            </w:r>
+            <w:r>
+              <w:rPr>
+                <w:rFonts w:ascii="Arial" w:cs="Arial" w:eastAsia="Arial" w:hAnsi="Arial"/>
+                <w:sz w:val="20"/>
+                <w:szCs w:val="20"/>
+              </w:rPr>
+              <w:br/>
+              <w:t xml:space="preserve"/>
+            </w:r>
+            <w:r>
+              <w:rPr>
+                <w:rFonts w:ascii="Arial" w:cs="Arial" w:eastAsia="Arial" w:hAnsi="Arial"/>
+                <w:b/>
+                <w:bCs/>
+                <w:i w:val="false"/>
+                <w:iCs w:val="false"/>
+                <w:color w:val="000000"/>
+                <w:sz w:val="20"/>
+                <w:szCs w:val="20"/>
+              </w:rPr>
+              <w:t xml:space="preserve">    Intermediate: </w:t>
+            </w:r>
+            <w:r>
+              <w:rPr>
+                <w:rFonts w:ascii="Arial" w:cs="Arial" w:eastAsia="Arial" w:hAnsi="Arial"/>
+                <w:b w:val="false"/>
+                <w:bCs w:val="false"/>
+                <w:i w:val="false"/>
+                <w:iCs w:val="false"/>
+                <w:color w:val="000000"/>
+                <w:sz w:val="20"/>
+                <w:szCs w:val="20"/>
+              </w:rPr>
+              <w:t xml:space="preserve">Describe an everyday algorithm (like making a peanut butter sandwich, getting ready for school, or ordering a pizza) in 7-10 precise steps.…</w:t>
+            </w:r>
+            <w:r>
+              <w:rPr>
+                <w:rFonts w:ascii="Arial" w:cs="Arial" w:eastAsia="Arial" w:hAnsi="Arial"/>
+                <w:sz w:val="20"/>
+                <w:szCs w:val="20"/>
+              </w:rPr>
+              <w:br/>
+              <w:t xml:space="preserve"/>
+            </w:r>
+            <w:r>
+              <w:rPr>
+                <w:rFonts w:ascii="Arial" w:cs="Arial" w:eastAsia="Arial" w:hAnsi="Arial"/>
+                <w:b/>
+                <w:bCs/>
+                <w:i w:val="false"/>
+                <w:iCs w:val="false"/>
+                <w:color w:val="000000"/>
+                <w:sz w:val="20"/>
+                <w:szCs w:val="20"/>
+              </w:rPr>
+              <w:t xml:space="preserve">    Challenge: </w:t>
+            </w:r>
+            <w:r>
+              <w:rPr>
+                <w:rFonts w:ascii="Arial" w:cs="Arial" w:eastAsia="Arial" w:hAnsi="Arial"/>
+                <w:b w:val="false"/>
+                <w:bCs w:val="false"/>
+                <w:i w:val="false"/>
+                <w:iCs w:val="false"/>
+                <w:color w:val="000000"/>
+                <w:sz w:val="20"/>
+                <w:szCs w:val="20"/>
+              </w:rPr>
+              <w:t xml:space="preserve">Draw a simple flowchart (or describe one in text) for the following: "If the door is locked, find a key and unlock it. Then open the door an…</w:t>
+            </w:r>
+            <w:r>
+              <w:rPr>
+                <w:rFonts w:ascii="Arial" w:cs="Arial" w:eastAsia="Arial" w:hAnsi="Arial"/>
+                <w:sz w:val="20"/>
+                <w:szCs w:val="20"/>
+              </w:rPr>
+              <w:br/>
+              <w:t xml:space="preserve"/>
+            </w:r>
+            <w:r>
+              <w:rPr>
+                <w:rFonts w:ascii="Arial" w:cs="Arial" w:eastAsia="Arial" w:hAnsi="Arial"/>
+                <w:sz w:val="20"/>
+                <w:szCs w:val="20"/>
+              </w:rPr>
+              <w:br/>
+              <w:t xml:space="preserve"/>
+            </w:r>
+            <w:r>
+              <w:rPr>
+                <w:rFonts w:ascii="Arial" w:cs="Arial" w:eastAsia="Arial" w:hAnsi="Arial"/>
+                <w:b w:val="false"/>
+                <w:bCs w:val="false"/>
+                <w:i/>
+                <w:iCs/>
+                <w:color w:val="555555"/>
+                <w:sz w:val="20"/>
+                <w:szCs w:val="20"/>
+              </w:rPr>
+              <w:t xml:space="preserve">→ Teacher circulates — offer hints, check for understanding.</w:t>
             </w:r>
           </w:p>
         </w:tc>
@@ -493,9 +1263,9 @@
               <w:right w:val="single" w:color="CCCCCC" w:sz="1"/>
             </w:tcBorders>
             <w:tcMar>
-              <w:top w:type="dxa" w:w="60"/>
+              <w:top w:type="dxa" w:w="80"/>
               <w:left w:type="dxa" w:w="120"/>
-              <w:bottom w:type="dxa" w:w="60"/>
+              <w:bottom w:type="dxa" w:w="80"/>
               <w:right w:type="dxa" w:w="120"/>
             </w:tcMar>
           </w:tcPr>
@@ -522,20 +1292,90 @@
               <w:right w:val="single" w:color="CCCCCC" w:sz="1"/>
             </w:tcBorders>
             <w:tcMar>
-              <w:top w:type="dxa" w:w="60"/>
+              <w:top w:type="dxa" w:w="80"/>
               <w:left w:type="dxa" w:w="120"/>
-              <w:bottom w:type="dxa" w:w="60"/>
+              <w:bottom w:type="dxa" w:w="80"/>
               <w:right w:type="dxa" w:w="120"/>
             </w:tcMar>
           </w:tcPr>
           <w:p>
-            <w:r>
-              <w:rPr>
-                <w:rFonts w:ascii="Arial" w:cs="Arial" w:eastAsia="Arial" w:hAnsi="Arial"/>
-                <w:sz w:val="20"/>
-                <w:szCs w:val="20"/>
+            <w:pPr>
+              <w:spacing w:after="80" w:before="80"/>
+            </w:pPr>
+            <w:r>
+              <w:rPr>
+                <w:rFonts w:ascii="Arial" w:cs="Arial" w:eastAsia="Arial" w:hAnsi="Arial"/>
+                <w:b/>
+                <w:bCs/>
+                <w:i w:val="false"/>
+                <w:iCs w:val="false"/>
+                <w:color w:val="000000"/>
+                <w:sz w:val="22"/>
+                <w:szCs w:val="22"/>
               </w:rPr>
               <w:t xml:space="preserve">Exit Ticket / Wrap-Up</w:t>
+            </w:r>
+            <w:r>
+              <w:rPr>
+                <w:rFonts w:ascii="Arial" w:cs="Arial" w:eastAsia="Arial" w:hAnsi="Arial"/>
+                <w:sz w:val="20"/>
+                <w:szCs w:val="20"/>
+              </w:rPr>
+              <w:br/>
+              <w:t xml:space="preserve"/>
+            </w:r>
+            <w:r>
+              <w:rPr>
+                <w:rFonts w:ascii="Arial" w:cs="Arial" w:eastAsia="Arial" w:hAnsi="Arial"/>
+                <w:sz w:val="20"/>
+                <w:szCs w:val="20"/>
+              </w:rPr>
+              <w:br/>
+              <w:t xml:space="preserve"/>
+            </w:r>
+            <w:r>
+              <w:rPr>
+                <w:rFonts w:ascii="Arial" w:cs="Arial" w:eastAsia="Arial" w:hAnsi="Arial"/>
+                <w:b w:val="false"/>
+                <w:bCs w:val="false"/>
+                <w:i w:val="false"/>
+                <w:iCs w:val="false"/>
+                <w:color w:val="000000"/>
+                <w:sz w:val="20"/>
+                <w:szCs w:val="20"/>
+              </w:rPr>
+              <w:t xml:space="preserve">Quick Check: Define computer science and explain what an algorithm is?</w:t>
+            </w:r>
+            <w:r>
+              <w:rPr>
+                <w:rFonts w:ascii="Arial" w:cs="Arial" w:eastAsia="Arial" w:hAnsi="Arial"/>
+                <w:sz w:val="20"/>
+                <w:szCs w:val="20"/>
+              </w:rPr>
+              <w:br/>
+              <w:t xml:space="preserve"/>
+            </w:r>
+            <w:r>
+              <w:rPr>
+                <w:rFonts w:ascii="Arial" w:cs="Arial" w:eastAsia="Arial" w:hAnsi="Arial"/>
+                <w:sz w:val="20"/>
+                <w:szCs w:val="20"/>
+              </w:rPr>
+              <w:br/>
+              <w:t xml:space="preserve"/>
+            </w:r>
+            <w:r>
+              <w:rPr>
+                <w:rFonts w:ascii="Arial" w:cs="Arial" w:eastAsia="Arial" w:hAnsi="Arial"/>
+                <w:b w:val="false"/>
+                <w:bCs w:val="false"/>
+                <w:i/>
+                <w:iCs/>
+                <w:color w:val="555555"/>
+                <w:sz w:val="20"/>
+                <w:szCs w:val="20"/>
+              </w:rPr>
+              <w:t xml:space="preserve">→ 3–2–1: Name 3 things learned, 2 new vocab words, 1 question you still have.</w:t>
             </w:r>
           </w:p>
         </w:tc>
@@ -772,7 +1612,7 @@
                 <w:sz w:val="18"/>
                 <w:szCs w:val="18"/>
               </w:rPr>
-              <w:t xml:space="preserve"># The classic first program</w:t>
+              <w:t xml:space="preserve">print("Hello, World!")</w:t>
             </w:r>
           </w:p>
           <w:p>
@@ -785,7 +1625,7 @@
                 <w:sz w:val="18"/>
                 <w:szCs w:val="18"/>
               </w:rPr>
-              <w:t xml:space="preserve">print("Hello, World!")</w:t>
+              <w:t xml:space="preserve"> </w:t>
             </w:r>
           </w:p>
           <w:p>
@@ -811,7 +1651,7 @@
                 <w:sz w:val="18"/>
                 <w:szCs w:val="18"/>
               </w:rPr>
-              <w:t xml:space="preserve"># Multiple print statements create multiple lines of output</w:t>
+              <w:t xml:space="preserve">print("Welcome to Python!")</w:t>
             </w:r>
           </w:p>
           <w:p>
@@ -824,7 +1664,7 @@
                 <w:sz w:val="18"/>
                 <w:szCs w:val="18"/>
               </w:rPr>
-              <w:t xml:space="preserve">print("Welcome to Python!")</w:t>
+              <w:t xml:space="preserve">print("I am excited to learn programming.")</w:t>
             </w:r>
           </w:p>
           <w:p>
@@ -837,7 +1677,7 @@
                 <w:sz w:val="18"/>
                 <w:szCs w:val="18"/>
               </w:rPr>
-              <w:t xml:space="preserve">print("I am excited to learn programming.")</w:t>
+              <w:t xml:space="preserve">print("This is fun!")</w:t>
             </w:r>
           </w:p>
           <w:p>
@@ -850,7 +1690,7 @@
                 <w:sz w:val="18"/>
                 <w:szCs w:val="18"/>
               </w:rPr>
-              <w:t xml:space="preserve">print("This is fun!")</w:t>
+              <w:t xml:space="preserve"> </w:t>
             </w:r>
           </w:p>
           <w:p>
@@ -876,7 +1716,7 @@
                 <w:sz w:val="18"/>
                 <w:szCs w:val="18"/>
               </w:rPr>
-              <w:t xml:space="preserve"># Using comments — the # symbol lets us add notes</w:t>
+              <w:t xml:space="preserve"> </w:t>
             </w:r>
           </w:p>
           <w:p>
@@ -889,33 +1729,7 @@
                 <w:sz w:val="18"/>
                 <w:szCs w:val="18"/>
               </w:rPr>
-              <w:t xml:space="preserve"># This line is a comment and will not execute</w:t>
-            </w:r>
-          </w:p>
-          <w:p>
-            <w:pPr>
-              <w:spacing w:after="20"/>
-            </w:pPr>
-            <w:r>
-              <w:rPr>
-                <w:rFonts w:ascii="Courier New" w:cs="Courier New" w:eastAsia="Courier New" w:hAnsi="Courier New"/>
-                <w:sz w:val="18"/>
-                <w:szCs w:val="18"/>
-              </w:rPr>
               <w:t xml:space="preserve">print("This will print")  # This comment explains the line</w:t>
-            </w:r>
-          </w:p>
-          <w:p>
-            <w:pPr>
-              <w:spacing w:after="20"/>
-            </w:pPr>
-            <w:r>
-              <w:rPr>
-                <w:rFonts w:ascii="Courier New" w:cs="Courier New" w:eastAsia="Courier New" w:hAnsi="Courier New"/>
-                <w:sz w:val="18"/>
-                <w:szCs w:val="18"/>
-              </w:rPr>
-              <w:t xml:space="preserve"># Comments help future readers understand your code</w:t>
             </w:r>
           </w:p>
         </w:tc>
@@ -969,19 +1783,6 @@
                 <w:sz w:val="18"/>
                 <w:szCs w:val="18"/>
               </w:rPr>
-              <w:t xml:space="preserve"># Starter code</w:t>
-            </w:r>
-          </w:p>
-          <w:p>
-            <w:pPr>
-              <w:spacing w:after="20"/>
-            </w:pPr>
-            <w:r>
-              <w:rPr>
-                <w:rFonts w:ascii="Courier New" w:cs="Courier New" w:eastAsia="Courier New" w:hAnsi="Courier New"/>
-                <w:sz w:val="18"/>
-                <w:szCs w:val="18"/>
-              </w:rPr>
               <w:t xml:space="preserve">print()</w:t>
             </w:r>
           </w:p>
@@ -1052,19 +1853,6 @@
               <w:right w:type="dxa" w:w="160"/>
             </w:tcMar>
           </w:tcPr>
-          <w:p>
-            <w:pPr>
-              <w:spacing w:after="20"/>
-            </w:pPr>
-            <w:r>
-              <w:rPr>
-                <w:rFonts w:ascii="Courier New" w:cs="Courier New" w:eastAsia="Courier New" w:hAnsi="Courier New"/>
-                <w:sz w:val="18"/>
-                <w:szCs w:val="18"/>
-              </w:rPr>
-              <w:t xml:space="preserve"># Problem 1 Example</w:t>
-            </w:r>
-          </w:p>
           <w:p>
             <w:pPr>
               <w:spacing w:after="20"/>

</xml_diff>

<commit_message>
Rewrote bell ringer exit script
</commit_message>
<xml_diff>
--- a/Coding 1 - year/Unit 1 - Intro to Programming/Daily Lesson Plans/Word/Day 1.docx
+++ b/Coding 1 - year/Unit 1 - Intro to Programming/Daily Lesson Plans/Word/Day 1.docx
@@ -380,7 +380,7 @@
                 <w:sz w:val="20"/>
                 <w:szCs w:val="20"/>
               </w:rPr>
-              <w:t xml:space="preserve">    How would you define computer science and explain what an algorithm is?</w:t>
+              <w:t xml:space="preserve">    Before we begin: what do you think "computer science" means? Take your best guess.</w:t>
             </w:r>
             <w:r>
               <w:rPr>
@@ -477,7 +477,7 @@
                 <w:sz w:val="20"/>
                 <w:szCs w:val="20"/>
               </w:rPr>
-              <w:t xml:space="preserve">Today's Goal: By the end of class you will be able to define computer science and explain what an algorithm is.</w:t>
+              <w:t xml:space="preserve">Today’s Goal: By the end of class you will be able to define computer science and explain what an algorithm is.</w:t>
             </w:r>
             <w:r>
               <w:rPr>
@@ -1344,7 +1344,7 @@
                 <w:sz w:val="20"/>
                 <w:szCs w:val="20"/>
               </w:rPr>
-              <w:t xml:space="preserve">Quick Check: Define computer science and explain what an algorithm is?</w:t>
+              <w:t xml:space="preserve">Define computer science in your own words and give one example of how it's used in code.</w:t>
             </w:r>
             <w:r>
               <w:rPr>

</xml_diff>